<commit_message>
C1 Book 2: fix three dialogue attributions in Unit 21
Two questions in Tracks 21.1 and 21.3 were asked and answered by the same
speaker, and the exchange added to Track 21.13 put a question in the mouth
of the student who had just answered. The questions now belong to Ms Huda
(who asks and does not state the finding) and to Mr Shihabi, and the 21.1
report follows the dialogue. Both files rebuilt; both still PASS at 51pp
and 34pp.

Co-Authored-By: Claude Opus 5 <noreply@anthropic.com>
Claude-Session: https://claude.ai/code/session_01Qyh7uRVsiebNero71esRN8
</commit_message>
<xml_diff>
--- a/proactive-english-c1-sy/out/PE-C1-BK2-SY_Unit21.docx
+++ b/proactive-english-c1-sy/out/PE-C1-BK2-SY_Unit21.docx
@@ -1475,7 +1475,7 @@
                 <w:sz w:val="22"/>
                 <w:szCs w:val="22"/>
               </w:rPr>
-              <w:t xml:space="preserve">Mrs Khoury</w:t>
+              <w:t xml:space="preserve">Ms Huda</w:t>
             </w:r>
           </w:p>
         </w:tc>
@@ -5070,7 +5070,7 @@
           <w:sz w:val="22"/>
           <w:szCs w:val="22"/>
         </w:rPr>
-        <w:t xml:space="preserve">Mrs Ajouz has sat the same test twice, fourteen months apart, and the writing was 6.5 both times, and the registration file needs 7.0 in every component: she has 7.5 in reading, 7.0 in listening, 7.0 in speaking and 6.5 in writing, and between the two tests she did about ninety hours of work, all of it on vocabulary. Mrs Khoury asked what the four things being marked are, and task response, coherence and cohesion, lexical resource, and grammatical range and accuracy, each weighted the same, so vocabulary is one of four, and ninety hours on one quarter of the mark when nobody had told her which quarter was costing her is the most ordinary mistake in examination preparation and is not her fault. Mr Attar asked whether the report said which one, and the report gives one number for writing and nothing else: no component marks, no comments and no script returned, so she rewrote the second answer from memory in August to find out what had been in it. Mrs Oueidat asked what was in it, and both sides of the question in four paragraphs and no position of her own anywhere, because she had been taught that an examination essay should be balanced, and the task had asked to what extent she agreed. Mrs Khoury said that is the cycle and it is not about her English at all, since the task asked one thing and she answered a different thing she had been taught to answer, and no amount of vocabulary repairs an unanswered question. Dr Qabbani asked what a score is, and a prediction about a person made by two strangers from one performance on four criteria in forty minutes, which is reasonable and is not a skill. Mrs Ajouz said she writes eleven queries to manufacturers a year and two recall notices, all in English and all acted on, and the registration board will not look at any of them. Mr Shihabi asked whether the number is wrong, and Mrs Oueidat said it is not wrong and it is narrow and the room must hold both. Mrs Tarabishi asked what a reader does with a number, and trusts it, because it is one number and a document is four pages. And Mrs Khoury said nobody at the examination will tell her which criterion the number was about, and the descriptors will, against her own script, which is the only route there is: you take the band you want, read its four criteria, and find in your own answer the sentence that earns each one, and where there is no sentence you have found the criterion that is costing you, which is a measurement and not an impression.</w:t>
+        <w:t xml:space="preserve">Mrs Ajouz has sat the same test twice, fourteen months apart, and the writing was 6.5 both times, and the registration file needs 7.0 in every component: she has 7.5 in reading, 7.0 in listening, 7.0 in speaking and 6.5 in writing, and between the two tests she did about ninety hours of work, all of it on vocabulary. Ms Huda asked what the four things being marked are, and Mrs Khoury said task response, coherence and cohesion, lexical resource, and grammatical range and accuracy, each weighted the same, so vocabulary is one of four, and ninety hours on one quarter of the mark when nobody had told her which quarter was costing her is the most ordinary mistake in examination preparation and is not her fault. Mr Attar asked whether the report said which one, and the report gives one number for writing and nothing else: no component marks, no comments and no script returned, so she rewrote the second answer from memory in August to find out what had been in it. Mrs Oueidat asked what was in it, and both sides of the question in four paragraphs and no position of her own anywhere, because she had been taught that an examination essay should be balanced, and the task had asked to what extent she agreed. Mrs Khoury said that is the cycle and it is not about her English at all, since the task asked one thing and she answered a different thing she had been taught to answer, and no amount of vocabulary repairs an unanswered question. Dr Qabbani asked what a score is, and a prediction about a person made by two strangers from one performance on four criteria in forty minutes, which is reasonable and is not a skill. Mrs Ajouz said she writes eleven queries to manufacturers a year and two recall notices, all in English and all acted on, and the registration board will not look at any of them. Mr Shihabi asked whether the number is wrong, and Mrs Oueidat said it is not wrong and it is narrow and the room must hold both. Mrs Tarabishi asked what a reader does with a number, and trusts it, because it is one number and a document is four pages. And Mrs Khoury said nobody at the examination will tell her which criterion the number was about, and the descriptors will, against her own script, which is the only route there is: you take the band you want, read its four criteria, and find in your own answer the sentence that earns each one, and where there is no sentence you have found the criterion that is costing you, which is a measurement and not an impression.</w:t>
       </w:r>
     </w:p>
     <w:p>
@@ -9057,7 +9057,7 @@
                 <w:sz w:val="22"/>
                 <w:szCs w:val="22"/>
               </w:rPr>
-              <w:t xml:space="preserve">Mrs Khoury</w:t>
+              <w:t xml:space="preserve">Ms Huda</w:t>
             </w:r>
           </w:p>
         </w:tc>
@@ -46053,7 +46053,7 @@
                 <w:sz w:val="22"/>
                 <w:szCs w:val="22"/>
               </w:rPr>
-              <w:t xml:space="preserve">Mrs Oueidat</w:t>
+              <w:t xml:space="preserve">Mr Shihabi</w:t>
             </w:r>
           </w:p>
         </w:tc>

</xml_diff>